<commit_message>
docs: finalize capstone deliverables (proposal, system design, deployment proof, final technical report)
</commit_message>
<xml_diff>
--- a/docs/deployment_proof.docx
+++ b/docs/deployment_proof.docx
@@ -2,6 +2,758 @@
 <file path=word/document.xml><?xml version="1.0" encoding="utf-8"?>
 <w:document xmlns:wpc="http://schemas.microsoft.com/office/word/2010/wordprocessingCanvas" xmlns:mc="http://schemas.openxmlformats.org/markup-compatibility/2006" xmlns:o="urn:schemas-microsoft-com:office:office" xmlns:r="http://schemas.openxmlformats.org/officeDocument/2006/relationships" xmlns:m="http://schemas.openxmlformats.org/officeDocument/2006/math" xmlns:v="urn:schemas-microsoft-com:vml" xmlns:wp="http://schemas.openxmlformats.org/drawingml/2006/wordprocessingDrawing" xmlns:w="http://schemas.openxmlformats.org/wordprocessingml/2006/main" xmlns:wpg="http://schemas.microsoft.com/office/word/2010/wordprocessingGroup" xmlns:wpi="http://schemas.microsoft.com/office/word/2010/wordprocessingInk" xmlns:a="http://schemas.openxmlformats.org/drawingml/2006/main" xmlns:wne="http://schemas.microsoft.com/office/word/2006/wordml" xmlns:wps="http://schemas.microsoft.com/office/word/2010/wordprocessingShape" xmlns:w10="urn:schemas-microsoft-com:office:word" xmlns:wp14="http://schemas.microsoft.com/office/word/2010/wordprocessingDrawing" xmlns:w14="http://schemas.microsoft.com/office/word/2010/wordml" xmlns:w15="http://schemas.microsoft.com/office/word/2012/wordml" xmlns:w16cex="http://schemas.microsoft.com/office/word/2018/wordml/cex" xmlns:w16cid="http://schemas.microsoft.com/office/word/2016/wordml/cid" xmlns:w16="http://schemas.microsoft.com/office/word/2018/wordml" xmlns:w16sdtdh="http://schemas.microsoft.com/office/word/2020/wordml/sdtdatahash" xmlns:w16se="http://schemas.microsoft.com/office/word/2015/wordml/symex" mc:Ignorable="w14 w15 w16se w16cid w16 w16cex w16sdtdh wp14">
   <w:body>
+    <w:p>
+      <w:pPr>
+        <w:pBdr/>
+        <w:spacing w:after="40"/>
+        <w:ind/>
+        <w:jc w:val="center"/>
+        <w:rPr>
+          <w:b/>
+          <w:bCs/>
+          <w:color w:val="1e3a8a"/>
+          <w:sz w:val="40"/>
+          <w:szCs w:val="40"/>
+          <w:highlight w:val="none"/>
+          <w:lang w:val="en"/>
+        </w:rPr>
+      </w:pPr>
+      <w:r>
+        <w:rPr>
+          <w:b/>
+          <w:color w:val="1e3a8a"/>
+          <w:sz w:val="40"/>
+          <w:lang w:val="en"/>
+        </w:rPr>
+        <w:t xml:space="preserve">Ghana Communication Technology University</w:t>
+      </w:r>
+      <w:r>
+        <w:rPr>
+          <w:b/>
+          <w:bCs/>
+          <w:color w:val="1e3a8a"/>
+          <w:sz w:val="40"/>
+          <w:szCs w:val="40"/>
+          <w:highlight w:val="none"/>
+          <w:lang w:val="en"/>
+        </w:rPr>
+      </w:r>
+    </w:p>
+    <w:p>
+      <w:pPr>
+        <w:pBdr/>
+        <w:spacing w:after="40"/>
+        <w:ind/>
+        <w:jc w:val="center"/>
+        <w:rPr>
+          <w:b/>
+          <w:bCs/>
+          <w:color w:val="1e3a8a"/>
+          <w:sz w:val="40"/>
+          <w:szCs w:val="40"/>
+          <w:highlight w:val="none"/>
+          <w:lang w:val="en"/>
+        </w:rPr>
+      </w:pPr>
+      <w:r>
+        <w:rPr>
+          <w:b/>
+          <w:color w:val="1e3a8a"/>
+          <w:sz w:val="40"/>
+          <w:highlight w:val="none"/>
+          <w:lang w:val="en" w:bidi="en"/>
+        </w:rPr>
+      </w:r>
+      <w:r>
+        <w:rPr>
+          <w:b/>
+          <w:color w:val="1e3a8a"/>
+          <w:sz w:val="40"/>
+          <w:highlight w:val="none"/>
+          <w:lang w:val="en" w:bidi="en"/>
+        </w:rPr>
+      </w:r>
+      <w:r>
+        <w:rPr>
+          <w:b/>
+          <w:color w:val="1e3a8a"/>
+          <w:sz w:val="40"/>
+          <w:highlight w:val="none"/>
+          <w:lang w:val="en"/>
+        </w:rPr>
+      </w:r>
+    </w:p>
+    <w:p>
+      <w:pPr>
+        <w:pBdr/>
+        <w:spacing w:after="40"/>
+        <w:ind/>
+        <w:jc w:val="center"/>
+        <w:rPr>
+          <w:b/>
+          <w:bCs/>
+          <w:color w:val="1e3a8a"/>
+          <w:sz w:val="40"/>
+          <w:szCs w:val="40"/>
+          <w:highlight w:val="none"/>
+          <w:lang w:val="en"/>
+        </w:rPr>
+      </w:pPr>
+      <w:r>
+        <w:rPr>
+          <w:b/>
+          <w:color w:val="1e3a8a"/>
+          <w:sz w:val="40"/>
+          <w:highlight w:val="none"/>
+          <w:lang w:val="en"/>
+        </w:rPr>
+      </w:r>
+      <w:r>
+        <w:rPr>
+          <w:b/>
+          <w:color w:val="1e3a8a"/>
+          <w:sz w:val="40"/>
+          <w:highlight w:val="none"/>
+          <w:lang w:val="en"/>
+        </w:rPr>
+      </w:r>
+      <w:r>
+        <w:rPr>
+          <w:b/>
+          <w:color w:val="1e3a8a"/>
+          <w:sz w:val="40"/>
+          <w:highlight w:val="none"/>
+          <w:lang w:val="en"/>
+        </w:rPr>
+      </w:r>
+      <w:r>
+        <w:rPr>
+          <w:b/>
+          <w:color w:val="1e3a8a"/>
+          <w:sz w:val="40"/>
+          <w:highlight w:val="none"/>
+          <w:lang w:val="en"/>
+        </w:rPr>
+      </w:r>
+      <w:r>
+        <w:rPr>
+          <w:b/>
+          <w:color w:val="1e3a8a"/>
+          <w:sz w:val="40"/>
+          <w:highlight w:val="none"/>
+          <w:lang w:val="en"/>
+        </w:rPr>
+        <mc:AlternateContent>
+          <mc:Choice Requires="wpg">
+            <w:drawing>
+              <wp:inline xmlns:wp="http://schemas.openxmlformats.org/drawingml/2006/wordprocessingDrawing" distT="0" distB="0" distL="0" distR="0">
+                <wp:extent cx="3069975" cy="3069975"/>
+                <wp:effectExtent l="0" t="0" r="0" b="0"/>
+                <wp:docPr id="1" name=""/>
+                <wp:cNvGraphicFramePr>
+                  <a:graphicFrameLocks xmlns:a="http://schemas.openxmlformats.org/drawingml/2006/main" noChangeAspect="1"/>
+                </wp:cNvGraphicFramePr>
+                <a:graphic xmlns:a="http://schemas.openxmlformats.org/drawingml/2006/main">
+                  <a:graphicData uri="http://schemas.openxmlformats.org/drawingml/2006/picture">
+                    <pic:pic xmlns:pic="http://schemas.openxmlformats.org/drawingml/2006/picture">
+                      <pic:nvPicPr>
+                        <pic:cNvPr id="2044302162" name=""/>
+                        <pic:cNvPicPr>
+                          <a:picLocks noChangeAspect="1"/>
+                        </pic:cNvPicPr>
+                        <pic:nvPr/>
+                      </pic:nvPicPr>
+                      <pic:blipFill rotWithShape="1">
+                        <a:blip r:embed="rId11"/>
+                        <a:stretch/>
+                      </pic:blipFill>
+                      <pic:spPr bwMode="auto">
+                        <a:xfrm flipH="0" flipV="0">
+                          <a:off x="0" y="0"/>
+                          <a:ext cx="3069974" cy="3069974"/>
+                        </a:xfrm>
+                        <a:prstGeom prst="rect">
+                          <a:avLst/>
+                        </a:prstGeom>
+                      </pic:spPr>
+                    </pic:pic>
+                  </a:graphicData>
+                </a:graphic>
+              </wp:inline>
+            </w:drawing>
+          </mc:Choice>
+          <mc:Fallback>
+            <w:pict>
+              <v:shapetype id="_x0000_t75" coordsize="21600,21600" o:spt="75" o:preferrelative="t" path="m@4@5l@4@11@9@11@9@5xe" filled="f" stroked="f">
+                <v:stroke joinstyle="miter"/>
+                <v:formulas>
+                  <v:f eqn="if lineDrawn pixelLineWidth 0"/>
+                  <v:f eqn="sum @0 1 0"/>
+                  <v:f eqn="sum 0 0 @1"/>
+                  <v:f eqn="prod @2 1 2"/>
+                  <v:f eqn="prod @3 21600 pixelWidth"/>
+                  <v:f eqn="prod @3 21600 pixelHeight"/>
+                  <v:f eqn="sum @0 0 1"/>
+                  <v:f eqn="prod @6 1 2"/>
+                  <v:f eqn="prod @7 21600 pixelWidth"/>
+                  <v:f eqn="sum @8 21600 0"/>
+                  <v:f eqn="prod @7 21600 pixelHeight"/>
+                  <v:f eqn="sum @10 21600 0"/>
+                </v:formulas>
+                <v:path o:extrusionok="f" gradientshapeok="t" o:connecttype="rect"/>
+                <o:lock v:ext="edit" aspectratio="t"/>
+              </v:shapetype>
+              <v:shape id="_x0000_i0" o:spid="_x0000_s0" type="#_x0000_t75" style="width:241.73pt;height:241.73pt;mso-wrap-distance-left:0.00pt;mso-wrap-distance-top:0.00pt;mso-wrap-distance-right:0.00pt;mso-wrap-distance-bottom:0.00pt;z-index:1;" stroked="false">
+                <v:imagedata r:id="rId11" o:title=""/>
+                <o:lock v:ext="edit" rotation="t"/>
+              </v:shape>
+            </w:pict>
+          </mc:Fallback>
+        </mc:AlternateContent>
+      </w:r>
+      <w:r>
+        <w:rPr>
+          <w:b/>
+          <w:color w:val="1e3a8a"/>
+          <w:sz w:val="40"/>
+          <w:highlight w:val="none"/>
+          <w:lang w:val="en"/>
+        </w:rPr>
+      </w:r>
+      <w:r>
+        <w:rPr>
+          <w:b/>
+          <w:color w:val="1e3a8a"/>
+          <w:sz w:val="40"/>
+          <w:highlight w:val="none"/>
+          <w:lang w:val="en"/>
+        </w:rPr>
+      </w:r>
+      <w:r>
+        <w:rPr>
+          <w:b/>
+          <w:bCs/>
+          <w:color w:val="1e3a8a"/>
+          <w:sz w:val="40"/>
+          <w:szCs w:val="40"/>
+        </w:rPr>
+      </w:r>
+    </w:p>
+    <w:p>
+      <w:pPr>
+        <w:pBdr/>
+        <w:spacing w:after="40"/>
+        <w:ind/>
+        <w:jc w:val="left"/>
+        <w:rPr>
+          <w:b/>
+          <w:bCs/>
+          <w:color w:val="1e3a8a"/>
+          <w:sz w:val="40"/>
+          <w:szCs w:val="40"/>
+        </w:rPr>
+      </w:pPr>
+      <w:r>
+        <w:rPr>
+          <w:b/>
+          <w:bCs/>
+          <w:color w:val="1e3a8a"/>
+          <w:sz w:val="40"/>
+          <w:szCs w:val="40"/>
+        </w:rPr>
+      </w:r>
+      <w:r>
+        <w:rPr>
+          <w:b/>
+          <w:bCs/>
+          <w:color w:val="1e3a8a"/>
+          <w:sz w:val="40"/>
+          <w:szCs w:val="40"/>
+        </w:rPr>
+      </w:r>
+      <w:r>
+        <w:rPr>
+          <w:b/>
+          <w:bCs/>
+          <w:color w:val="1e3a8a"/>
+          <w:sz w:val="40"/>
+          <w:szCs w:val="40"/>
+        </w:rPr>
+      </w:r>
+    </w:p>
+    <w:p>
+      <w:pPr>
+        <w:pBdr/>
+        <w:spacing w:after="40"/>
+        <w:ind/>
+        <w:jc w:val="center"/>
+        <w:rPr>
+          <w:b/>
+          <w:bCs/>
+          <w:color w:val="1e3a8a"/>
+          <w:sz w:val="40"/>
+          <w:szCs w:val="40"/>
+          <w:highlight w:val="none"/>
+        </w:rPr>
+      </w:pPr>
+      <w:r>
+        <w:rPr>
+          <w:b/>
+          <w:bCs/>
+          <w:color w:val="1e3a8a"/>
+          <w:sz w:val="40"/>
+          <w:szCs w:val="40"/>
+          <w:lang w:val="en"/>
+        </w:rPr>
+        <w:t xml:space="preserve">CSBC 252 – Introduction to Cloud Computing</w:t>
+      </w:r>
+      <w:r>
+        <w:rPr>
+          <w:b/>
+          <w:bCs/>
+          <w:color w:val="1e3a8a"/>
+          <w:sz w:val="40"/>
+          <w:szCs w:val="40"/>
+        </w:rPr>
+      </w:r>
+      <w:r>
+        <w:rPr>
+          <w:b/>
+          <w:bCs/>
+          <w:color w:val="1e3a8a"/>
+          <w:sz w:val="40"/>
+          <w:szCs w:val="40"/>
+        </w:rPr>
+      </w:r>
+    </w:p>
+    <w:p>
+      <w:pPr>
+        <w:pBdr/>
+        <w:spacing w:after="40"/>
+        <w:ind/>
+        <w:jc w:val="center"/>
+        <w:rPr>
+          <w:b/>
+          <w:bCs/>
+          <w:color w:val="1e3a8a"/>
+          <w:sz w:val="40"/>
+          <w:szCs w:val="40"/>
+          <w:highlight w:val="none"/>
+          <w:lang w:val="en"/>
+        </w:rPr>
+      </w:pPr>
+      <w:r>
+        <w:rPr>
+          <w:b/>
+          <w:color w:val="1e3a8a"/>
+          <w:sz w:val="40"/>
+          <w:highlight w:val="none"/>
+          <w:lang w:val="en"/>
+        </w:rPr>
+        <w:t xml:space="preserve">Cybersecurity Group D</w:t>
+      </w:r>
+      <w:r>
+        <w:rPr>
+          <w:b/>
+          <w:bCs/>
+          <w:color w:val="1e3a8a"/>
+          <w:sz w:val="40"/>
+          <w:szCs w:val="40"/>
+          <w:highlight w:val="none"/>
+          <w:lang w:val="en"/>
+        </w:rPr>
+      </w:r>
+    </w:p>
+    <w:p>
+      <w:pPr>
+        <w:pBdr/>
+        <w:spacing w:after="40"/>
+        <w:ind/>
+        <w:jc w:val="center"/>
+        <w:rPr>
+          <w:b/>
+          <w:bCs/>
+          <w:color w:val="1e3a8a"/>
+          <w:sz w:val="40"/>
+          <w:szCs w:val="40"/>
+          <w:highlight w:val="none"/>
+          <w:lang w:val="en"/>
+        </w:rPr>
+      </w:pPr>
+      <w:r>
+        <w:rPr>
+          <w:b/>
+          <w:color w:val="1e3a8a"/>
+          <w:sz w:val="40"/>
+          <w:highlight w:val="none"/>
+          <w:lang w:val="en" w:bidi="en"/>
+        </w:rPr>
+      </w:r>
+      <w:r>
+        <w:rPr>
+          <w:b/>
+          <w:color w:val="1e3a8a"/>
+          <w:sz w:val="40"/>
+          <w:highlight w:val="none"/>
+          <w:lang w:val="en" w:bidi="en"/>
+        </w:rPr>
+      </w:r>
+      <w:r>
+        <w:rPr>
+          <w:b/>
+          <w:color w:val="1e3a8a"/>
+          <w:sz w:val="40"/>
+          <w:highlight w:val="none"/>
+          <w:lang w:val="en"/>
+        </w:rPr>
+      </w:r>
+    </w:p>
+    <w:p>
+      <w:pPr>
+        <w:pBdr/>
+        <w:spacing w:after="40"/>
+        <w:ind/>
+        <w:jc w:val="center"/>
+        <w:rPr>
+          <w:b/>
+          <w:bCs/>
+          <w:color w:val="1e3a8a"/>
+          <w:sz w:val="40"/>
+          <w:szCs w:val="40"/>
+          <w:highlight w:val="none"/>
+          <w:lang w:val="en"/>
+        </w:rPr>
+      </w:pPr>
+      <w:r>
+        <w:rPr>
+          <w:b/>
+          <w:color w:val="1e3a8a"/>
+          <w:sz w:val="40"/>
+          <w:highlight w:val="none"/>
+          <w:lang w:val="en"/>
+        </w:rPr>
+        <w:t xml:space="preserve">Group 2</w:t>
+      </w:r>
+      <w:r>
+        <w:rPr>
+          <w:b/>
+          <w:bCs/>
+          <w:color w:val="1e3a8a"/>
+          <w:sz w:val="40"/>
+          <w:szCs w:val="40"/>
+        </w:rPr>
+      </w:r>
+    </w:p>
+    <w:p>
+      <w:pPr>
+        <w:pBdr/>
+        <w:spacing w:after="40"/>
+        <w:ind/>
+        <w:jc w:val="center"/>
+        <w:rPr>
+          <w:b/>
+          <w:bCs/>
+          <w:color w:val="1e3a8a"/>
+          <w:sz w:val="40"/>
+          <w:szCs w:val="40"/>
+          <w:highlight w:val="none"/>
+        </w:rPr>
+      </w:pPr>
+      <w:r>
+        <w:rPr>
+          <w:b/>
+          <w:color w:val="1e3a8a"/>
+          <w:sz w:val="40"/>
+          <w:highlight w:val="none"/>
+          <w:lang w:val="en"/>
+        </w:rPr>
+        <w:t xml:space="preserve">Semester Two</w:t>
+      </w:r>
+      <w:r>
+        <w:rPr>
+          <w:b/>
+          <w:bCs/>
+          <w:color w:val="1e3a8a"/>
+          <w:sz w:val="40"/>
+          <w:szCs w:val="40"/>
+        </w:rPr>
+      </w:r>
+      <w:r>
+        <w:rPr>
+          <w:b/>
+          <w:bCs/>
+          <w:color w:val="1e3a8a"/>
+          <w:sz w:val="40"/>
+          <w:szCs w:val="40"/>
+          <w:highlight w:val="none"/>
+          <w:lang w:val="en"/>
+        </w:rPr>
+      </w:r>
+    </w:p>
+    <w:p>
+      <w:pPr>
+        <w:pBdr/>
+        <w:spacing w:after="40"/>
+        <w:ind/>
+        <w:jc w:val="center"/>
+        <w:rPr>
+          <w:b/>
+          <w:bCs/>
+          <w:color w:val="1e3a8a"/>
+          <w:sz w:val="40"/>
+          <w:szCs w:val="40"/>
+          <w:highlight w:val="none"/>
+          <w:lang w:val="en" w:bidi="en"/>
+        </w:rPr>
+      </w:pPr>
+      <w:r>
+        <w:rPr>
+          <w:b/>
+          <w:bCs/>
+          <w:color w:val="1e3a8a"/>
+          <w:sz w:val="40"/>
+          <w:szCs w:val="40"/>
+          <w:highlight w:val="none"/>
+          <w:lang w:val="en" w:bidi="en"/>
+        </w:rPr>
+        <w:t xml:space="preserve">Level 200</w:t>
+      </w:r>
+      <w:r>
+        <w:rPr>
+          <w:b/>
+          <w:bCs/>
+          <w:color w:val="1e3a8a"/>
+          <w:sz w:val="40"/>
+          <w:szCs w:val="40"/>
+          <w:highlight w:val="none"/>
+          <w:lang w:val="en" w:bidi="en"/>
+        </w:rPr>
+      </w:r>
+    </w:p>
+    <w:p>
+      <w:pPr>
+        <w:pBdr/>
+        <w:spacing w:after="40"/>
+        <w:ind/>
+        <w:jc w:val="center"/>
+        <w:rPr>
+          <w:b/>
+          <w:bCs/>
+          <w:color w:val="1e3a8a"/>
+          <w:sz w:val="40"/>
+          <w:szCs w:val="40"/>
+          <w:highlight w:val="none"/>
+          <w:lang w:val="en" w:bidi="en"/>
+        </w:rPr>
+      </w:pPr>
+      <w:r>
+        <w:rPr>
+          <w:b/>
+          <w:bCs/>
+          <w:color w:val="1e3a8a"/>
+          <w:sz w:val="40"/>
+          <w:szCs w:val="40"/>
+          <w:highlight w:val="none"/>
+          <w:lang w:val="en" w:bidi="en"/>
+        </w:rPr>
+      </w:r>
+      <w:r>
+        <w:rPr>
+          <w:b/>
+          <w:bCs/>
+          <w:color w:val="1e3a8a"/>
+          <w:sz w:val="40"/>
+          <w:szCs w:val="40"/>
+          <w:highlight w:val="none"/>
+          <w:lang w:val="en" w:bidi="en"/>
+        </w:rPr>
+      </w:r>
+      <w:r>
+        <w:rPr>
+          <w:b/>
+          <w:bCs/>
+          <w:color w:val="1e3a8a"/>
+          <w:sz w:val="40"/>
+          <w:szCs w:val="40"/>
+          <w:highlight w:val="none"/>
+          <w:lang w:val="en" w:bidi="en"/>
+        </w:rPr>
+      </w:r>
+    </w:p>
+    <w:p>
+      <w:pPr>
+        <w:pBdr/>
+        <w:spacing w:after="40"/>
+        <w:ind/>
+        <w:jc w:val="center"/>
+        <w:rPr>
+          <w:b/>
+          <w:bCs/>
+          <w:color w:val="1e3a8a"/>
+          <w:sz w:val="40"/>
+          <w:szCs w:val="40"/>
+          <w:highlight w:val="none"/>
+          <w:lang w:val="en" w:bidi="en"/>
+        </w:rPr>
+      </w:pPr>
+      <w:r>
+        <w:rPr>
+          <w:b/>
+          <w:bCs/>
+          <w:color w:val="1e3a8a"/>
+          <w:sz w:val="40"/>
+          <w:szCs w:val="40"/>
+          <w:highlight w:val="none"/>
+          <w:lang w:val="en" w:bidi="en"/>
+        </w:rPr>
+        <w:t xml:space="preserve">Mr. Nasir Karim</w:t>
+      </w:r>
+      <w:r>
+        <w:rPr>
+          <w:b/>
+          <w:bCs/>
+          <w:color w:val="1e3a8a"/>
+          <w:sz w:val="40"/>
+          <w:szCs w:val="40"/>
+          <w:highlight w:val="none"/>
+          <w:lang w:val="en" w:bidi="en"/>
+        </w:rPr>
+      </w:r>
+      <w:r>
+        <w:rPr>
+          <w:b/>
+          <w:bCs/>
+          <w:color w:val="1e3a8a"/>
+          <w:sz w:val="40"/>
+          <w:szCs w:val="40"/>
+          <w:highlight w:val="none"/>
+          <w:lang w:val="en" w:bidi="en"/>
+        </w:rPr>
+      </w:r>
+    </w:p>
+    <w:p>
+      <w:pPr>
+        <w:pBdr/>
+        <w:spacing w:after="40"/>
+        <w:ind/>
+        <w:jc w:val="center"/>
+        <w:rPr>
+          <w:b/>
+          <w:bCs/>
+          <w:color w:val="1e3a8a"/>
+          <w:sz w:val="40"/>
+          <w:szCs w:val="40"/>
+          <w:highlight w:val="none"/>
+          <w:lang w:val="en" w:bidi="en"/>
+        </w:rPr>
+      </w:pPr>
+      <w:r>
+        <w:rPr>
+          <w:b/>
+          <w:bCs/>
+          <w:color w:val="1e3a8a"/>
+          <w:sz w:val="40"/>
+          <w:szCs w:val="40"/>
+          <w:highlight w:val="none"/>
+          <w:lang w:val="en" w:bidi="en"/>
+        </w:rPr>
+      </w:r>
+      <w:r>
+        <w:rPr>
+          <w:b/>
+          <w:bCs/>
+          <w:color w:val="1e3a8a"/>
+          <w:sz w:val="40"/>
+          <w:szCs w:val="40"/>
+          <w:highlight w:val="none"/>
+          <w:lang w:val="en" w:bidi="en"/>
+        </w:rPr>
+      </w:r>
+      <w:r>
+        <w:rPr>
+          <w:b/>
+          <w:bCs/>
+          <w:color w:val="1e3a8a"/>
+          <w:sz w:val="40"/>
+          <w:szCs w:val="40"/>
+          <w:highlight w:val="none"/>
+          <w:lang w:val="en" w:bidi="en"/>
+        </w:rPr>
+      </w:r>
+    </w:p>
+    <w:p>
+      <w:pPr>
+        <w:pBdr/>
+        <w:spacing w:after="40"/>
+        <w:ind/>
+        <w:jc w:val="center"/>
+        <w:rPr>
+          <w:b/>
+          <w:bCs/>
+          <w:color w:val="1e3a8a"/>
+          <w:sz w:val="40"/>
+          <w:szCs w:val="40"/>
+          <w:highlight w:val="none"/>
+          <w:lang w:val="en" w:bidi="en"/>
+        </w:rPr>
+      </w:pPr>
+      <w:r>
+        <w:rPr>
+          <w:b/>
+          <w:bCs/>
+          <w:color w:val="1e3a8a"/>
+          <w:sz w:val="40"/>
+          <w:szCs w:val="40"/>
+          <w:highlight w:val="none"/>
+          <w:lang w:val="en" w:bidi="en"/>
+        </w:rPr>
+        <w:t xml:space="preserve">CampusFind – Semester Capstone Project</w:t>
+      </w:r>
+      <w:r>
+        <w:rPr>
+          <w:b/>
+          <w:bCs/>
+          <w:color w:val="1e3a8a"/>
+          <w:sz w:val="40"/>
+          <w:szCs w:val="40"/>
+          <w:highlight w:val="none"/>
+          <w:lang w:val="en" w:bidi="en"/>
+        </w:rPr>
+      </w:r>
+      <w:r>
+        <w:rPr>
+          <w:b/>
+          <w:bCs/>
+          <w:color w:val="1e3a8a"/>
+          <w:sz w:val="40"/>
+          <w:szCs w:val="40"/>
+          <w:highlight w:val="none"/>
+          <w:lang w:val="en" w:bidi="en"/>
+        </w:rPr>
+      </w:r>
+    </w:p>
+    <w:p>
+      <w:pPr>
+        <w:pBdr/>
+        <w:spacing w:after="40"/>
+        <w:ind/>
+        <w:rPr>
+          <w:b/>
+          <w:bCs/>
+          <w:color w:val="1e3a8a"/>
+          <w:sz w:val="40"/>
+          <w:szCs w:val="40"/>
+        </w:rPr>
+      </w:pPr>
+      <w:r>
+        <w:rPr>
+          <w:b/>
+          <w:color w:val="1e3a8a"/>
+          <w:sz w:val="40"/>
+        </w:rPr>
+      </w:r>
+      <w:r/>
+    </w:p>
     <w:p>
       <w:pPr>
         <w:pBdr/>
@@ -17,6 +769,7 @@
         </w:rPr>
         <w:t xml:space="preserve">CampusFind: AWS Cloud Deployment Proof Portfolio</w:t>
       </w:r>
+      <w:r/>
       <w:r/>
     </w:p>
     <w:p>
@@ -728,31 +1481,8 @@
                 <w:color w:val="1e293b"/>
                 <w:sz w:val="18"/>
               </w:rPr>
-              <w:t xml:space="preserve">• AWS Service / Scope: Compute / Amazon EC2</w:t>
-              <w:br/>
-              <w:t xml:space="preserve">• Required Evidence</w:t>
-            </w:r>
-            <w:r>
-              <w:rPr>
-                <w:color w:val="1e293b"/>
-                <w:sz w:val="18"/>
-              </w:rPr>
-              <w:t xml:space="preserve">: AWS Console showing EC2 Instance ID, Instance State (2/2 checks passed, 'running'), Instance Type (t2.micro), and Public IPv4 Address.</w:t>
-              <w:br/>
-              <w:t xml:space="preserve">• Verification Action: Open AWS Management Console &gt; EC2 &gt; Instances &gt; </w:t>
-              <w:br/>
-              <w:br/>
             </w:r>
             <w:r/>
-          </w:p>
-          <w:p>
-            <w:pPr>
-              <w:pBdr/>
-              <w:spacing w:after="240" w:before="160"/>
-              <w:ind/>
-              <w:jc w:val="center"/>
-              <w:rPr/>
-            </w:pPr>
             <w:r>
               <w:rPr>
                 <w:b/>
@@ -765,7 +1495,7 @@
                     <wp:inline xmlns:wp="http://schemas.openxmlformats.org/drawingml/2006/wordprocessingDrawing" distT="0" distB="0" distL="0" distR="0">
                       <wp:extent cx="5706450" cy="2761861"/>
                       <wp:effectExtent l="0" t="0" r="0" b="0"/>
-                      <wp:docPr id="1" name=""/>
+                      <wp:docPr id="2" name=""/>
                       <wp:cNvGraphicFramePr>
                         <a:graphicFrameLocks xmlns:a="http://schemas.openxmlformats.org/drawingml/2006/main" noChangeAspect="1"/>
                       </wp:cNvGraphicFramePr>
@@ -773,7 +1503,7 @@
                         <a:graphicData uri="http://schemas.openxmlformats.org/drawingml/2006/picture">
                           <pic:pic xmlns:pic="http://schemas.openxmlformats.org/drawingml/2006/picture">
                             <pic:nvPicPr>
-                              <pic:cNvPr id="2078857146" name=""/>
+                              <pic:cNvPr id="438013743" name=""/>
                               <pic:cNvPicPr>
                                 <a:picLocks noChangeAspect="1"/>
                               </pic:cNvPicPr>
@@ -819,7 +1549,7 @@
                       <v:path o:extrusionok="f" gradientshapeok="t" o:connecttype="rect"/>
                       <o:lock v:ext="edit" aspectratio="t"/>
                     </v:shapetype>
-                    <v:shape id="_x0000_i0" o:spid="_x0000_s0" type="#_x0000_t75" style="width:449.33pt;height:217.47pt;mso-wrap-distance-left:0.00pt;mso-wrap-distance-top:0.00pt;mso-wrap-distance-right:0.00pt;mso-wrap-distance-bottom:0.00pt;z-index:1;" stroked="false">
+                    <v:shape id="_x0000_i1" o:spid="_x0000_s1" type="#_x0000_t75" style="width:449.33pt;height:217.47pt;mso-wrap-distance-left:0.00pt;mso-wrap-distance-top:0.00pt;mso-wrap-distance-right:0.00pt;mso-wrap-distance-bottom:0.00pt;z-index:1;" stroked="false">
                       <v:imagedata r:id="rId12" o:title=""/>
                       <o:lock v:ext="edit" rotation="t"/>
                     </v:shape>
@@ -827,6 +1557,7 @@
                 </mc:Fallback>
               </mc:AlternateContent>
             </w:r>
+            <w:r/>
             <w:r/>
           </w:p>
         </w:tc>
@@ -930,7 +1661,7 @@
                     <wp:inline xmlns:wp="http://schemas.openxmlformats.org/drawingml/2006/wordprocessingDrawing" distT="0" distB="0" distL="0" distR="0">
                       <wp:extent cx="5754075" cy="2761861"/>
                       <wp:effectExtent l="0" t="0" r="0" b="0"/>
-                      <wp:docPr id="2" name=""/>
+                      <wp:docPr id="3" name=""/>
                       <wp:cNvGraphicFramePr>
                         <a:graphicFrameLocks xmlns:a="http://schemas.openxmlformats.org/drawingml/2006/main" noChangeAspect="1"/>
                       </wp:cNvGraphicFramePr>
@@ -984,7 +1715,7 @@
                       <v:path o:extrusionok="f" gradientshapeok="t" o:connecttype="rect"/>
                       <o:lock v:ext="edit" aspectratio="t"/>
                     </v:shapetype>
-                    <v:shape id="_x0000_i1" o:spid="_x0000_s1" type="#_x0000_t75" style="width:453.08pt;height:217.47pt;mso-wrap-distance-left:0.00pt;mso-wrap-distance-top:0.00pt;mso-wrap-distance-right:0.00pt;mso-wrap-distance-bottom:0.00pt;z-index:1;" stroked="false">
+                    <v:shape id="_x0000_i2" o:spid="_x0000_s2" type="#_x0000_t75" style="width:453.08pt;height:217.47pt;mso-wrap-distance-left:0.00pt;mso-wrap-distance-top:0.00pt;mso-wrap-distance-right:0.00pt;mso-wrap-distance-bottom:0.00pt;z-index:1;" stroked="false">
                       <v:imagedata r:id="rId13" o:title=""/>
                       <o:lock v:ext="edit" rotation="t"/>
                     </v:shape>
@@ -1087,7 +1818,7 @@
                     <wp:inline xmlns:wp="http://schemas.openxmlformats.org/drawingml/2006/wordprocessingDrawing" distT="0" distB="0" distL="0" distR="0">
                       <wp:extent cx="5677875" cy="2761861"/>
                       <wp:effectExtent l="0" t="0" r="0" b="0"/>
-                      <wp:docPr id="3" name=""/>
+                      <wp:docPr id="4" name=""/>
                       <wp:cNvGraphicFramePr>
                         <a:graphicFrameLocks xmlns:a="http://schemas.openxmlformats.org/drawingml/2006/main" noChangeAspect="1"/>
                       </wp:cNvGraphicFramePr>
@@ -1141,7 +1872,7 @@
                       <v:path o:extrusionok="f" gradientshapeok="t" o:connecttype="rect"/>
                       <o:lock v:ext="edit" aspectratio="t"/>
                     </v:shapetype>
-                    <v:shape id="_x0000_i2" o:spid="_x0000_s2" type="#_x0000_t75" style="width:447.08pt;height:217.47pt;mso-wrap-distance-left:0.00pt;mso-wrap-distance-top:0.00pt;mso-wrap-distance-right:0.00pt;mso-wrap-distance-bottom:0.00pt;z-index:1;" stroked="false">
+                    <v:shape id="_x0000_i3" o:spid="_x0000_s3" type="#_x0000_t75" style="width:447.08pt;height:217.47pt;mso-wrap-distance-left:0.00pt;mso-wrap-distance-top:0.00pt;mso-wrap-distance-right:0.00pt;mso-wrap-distance-bottom:0.00pt;z-index:1;" stroked="false">
                       <v:imagedata r:id="rId14" o:title=""/>
                       <o:lock v:ext="edit" rotation="t"/>
                     </v:shape>
@@ -1240,7 +1971,7 @@
                     <wp:inline xmlns:wp="http://schemas.openxmlformats.org/drawingml/2006/wordprocessingDrawing" distT="0" distB="0" distL="0" distR="0">
                       <wp:extent cx="5943600" cy="3142403"/>
                       <wp:effectExtent l="0" t="0" r="0" b="0"/>
-                      <wp:docPr id="4" name=""/>
+                      <wp:docPr id="5" name=""/>
                       <wp:cNvGraphicFramePr>
                         <a:graphicFrameLocks xmlns:a="http://schemas.openxmlformats.org/drawingml/2006/main" noChangeAspect="1"/>
                       </wp:cNvGraphicFramePr>
@@ -1294,7 +2025,7 @@
                       <v:path o:extrusionok="f" gradientshapeok="t" o:connecttype="rect"/>
                       <o:lock v:ext="edit" aspectratio="t"/>
                     </v:shapetype>
-                    <v:shape id="_x0000_i3" o:spid="_x0000_s3" type="#_x0000_t75" style="width:468.00pt;height:247.43pt;mso-wrap-distance-left:0.00pt;mso-wrap-distance-top:0.00pt;mso-wrap-distance-right:0.00pt;mso-wrap-distance-bottom:0.00pt;z-index:1;" stroked="false">
+                    <v:shape id="_x0000_i4" o:spid="_x0000_s4" type="#_x0000_t75" style="width:468.00pt;height:247.43pt;mso-wrap-distance-left:0.00pt;mso-wrap-distance-top:0.00pt;mso-wrap-distance-right:0.00pt;mso-wrap-distance-bottom:0.00pt;z-index:1;" stroked="false">
                       <v:imagedata r:id="rId15" o:title=""/>
                       <o:lock v:ext="edit" rotation="t"/>
                     </v:shape>
@@ -1396,7 +2127,7 @@
                     <wp:inline xmlns:wp="http://schemas.openxmlformats.org/drawingml/2006/wordprocessingDrawing" distT="0" distB="0" distL="0" distR="0">
                       <wp:extent cx="5487375" cy="2830809"/>
                       <wp:effectExtent l="0" t="0" r="0" b="0"/>
-                      <wp:docPr id="5" name=""/>
+                      <wp:docPr id="6" name=""/>
                       <wp:cNvGraphicFramePr>
                         <a:graphicFrameLocks xmlns:a="http://schemas.openxmlformats.org/drawingml/2006/main" noChangeAspect="1"/>
                       </wp:cNvGraphicFramePr>
@@ -1450,7 +2181,7 @@
                       <v:path o:extrusionok="f" gradientshapeok="t" o:connecttype="rect"/>
                       <o:lock v:ext="edit" aspectratio="t"/>
                     </v:shapetype>
-                    <v:shape id="_x0000_i4" o:spid="_x0000_s4" type="#_x0000_t75" style="width:432.08pt;height:222.90pt;mso-wrap-distance-left:0.00pt;mso-wrap-distance-top:0.00pt;mso-wrap-distance-right:0.00pt;mso-wrap-distance-bottom:0.00pt;z-index:1;" stroked="false">
+                    <v:shape id="_x0000_i5" o:spid="_x0000_s5" type="#_x0000_t75" style="width:432.08pt;height:222.90pt;mso-wrap-distance-left:0.00pt;mso-wrap-distance-top:0.00pt;mso-wrap-distance-right:0.00pt;mso-wrap-distance-bottom:0.00pt;z-index:1;" stroked="false">
                       <v:imagedata r:id="rId16" o:title=""/>
                       <o:lock v:ext="edit" rotation="t"/>
                     </v:shape>
@@ -1503,7 +2234,7 @@
                     <wp:inline xmlns:wp="http://schemas.openxmlformats.org/drawingml/2006/wordprocessingDrawing" distT="0" distB="0" distL="0" distR="0">
                       <wp:extent cx="5506425" cy="2830809"/>
                       <wp:effectExtent l="0" t="0" r="0" b="0"/>
-                      <wp:docPr id="6" name=""/>
+                      <wp:docPr id="7" name=""/>
                       <wp:cNvGraphicFramePr>
                         <a:graphicFrameLocks xmlns:a="http://schemas.openxmlformats.org/drawingml/2006/main" noChangeAspect="1"/>
                       </wp:cNvGraphicFramePr>
@@ -1557,7 +2288,7 @@
                       <v:path o:extrusionok="f" gradientshapeok="t" o:connecttype="rect"/>
                       <o:lock v:ext="edit" aspectratio="t"/>
                     </v:shapetype>
-                    <v:shape id="_x0000_i5" o:spid="_x0000_s5" type="#_x0000_t75" style="width:433.58pt;height:222.90pt;mso-wrap-distance-left:0.00pt;mso-wrap-distance-top:0.00pt;mso-wrap-distance-right:0.00pt;mso-wrap-distance-bottom:0.00pt;z-index:1;" stroked="false">
+                    <v:shape id="_x0000_i6" o:spid="_x0000_s6" type="#_x0000_t75" style="width:433.58pt;height:222.90pt;mso-wrap-distance-left:0.00pt;mso-wrap-distance-top:0.00pt;mso-wrap-distance-right:0.00pt;mso-wrap-distance-bottom:0.00pt;z-index:1;" stroked="false">
                       <v:imagedata r:id="rId17" o:title=""/>
                       <o:lock v:ext="edit" rotation="t"/>
                     </v:shape>
@@ -1610,7 +2341,7 @@
                     <wp:inline xmlns:wp="http://schemas.openxmlformats.org/drawingml/2006/wordprocessingDrawing" distT="0" distB="0" distL="0" distR="0">
                       <wp:extent cx="5411175" cy="2830809"/>
                       <wp:effectExtent l="0" t="0" r="0" b="0"/>
-                      <wp:docPr id="7" name=""/>
+                      <wp:docPr id="8" name=""/>
                       <wp:cNvGraphicFramePr>
                         <a:graphicFrameLocks xmlns:a="http://schemas.openxmlformats.org/drawingml/2006/main" noChangeAspect="1"/>
                       </wp:cNvGraphicFramePr>
@@ -1664,7 +2395,7 @@
                       <v:path o:extrusionok="f" gradientshapeok="t" o:connecttype="rect"/>
                       <o:lock v:ext="edit" aspectratio="t"/>
                     </v:shapetype>
-                    <v:shape id="_x0000_i6" o:spid="_x0000_s6" type="#_x0000_t75" style="width:426.08pt;height:222.90pt;mso-wrap-distance-left:0.00pt;mso-wrap-distance-top:0.00pt;mso-wrap-distance-right:0.00pt;mso-wrap-distance-bottom:0.00pt;z-index:1;" stroked="false">
+                    <v:shape id="_x0000_i7" o:spid="_x0000_s7" type="#_x0000_t75" style="width:426.08pt;height:222.90pt;mso-wrap-distance-left:0.00pt;mso-wrap-distance-top:0.00pt;mso-wrap-distance-right:0.00pt;mso-wrap-distance-bottom:0.00pt;z-index:1;" stroked="false">
                       <v:imagedata r:id="rId18" o:title=""/>
                       <o:lock v:ext="edit" rotation="t"/>
                     </v:shape>
@@ -1717,7 +2448,7 @@
                     <wp:inline xmlns:wp="http://schemas.openxmlformats.org/drawingml/2006/wordprocessingDrawing" distT="0" distB="0" distL="0" distR="0">
                       <wp:extent cx="5439750" cy="2830809"/>
                       <wp:effectExtent l="0" t="0" r="0" b="0"/>
-                      <wp:docPr id="8" name=""/>
+                      <wp:docPr id="9" name=""/>
                       <wp:cNvGraphicFramePr>
                         <a:graphicFrameLocks xmlns:a="http://schemas.openxmlformats.org/drawingml/2006/main" noChangeAspect="1"/>
                       </wp:cNvGraphicFramePr>
@@ -1771,7 +2502,7 @@
                       <v:path o:extrusionok="f" gradientshapeok="t" o:connecttype="rect"/>
                       <o:lock v:ext="edit" aspectratio="t"/>
                     </v:shapetype>
-                    <v:shape id="_x0000_i7" o:spid="_x0000_s7" type="#_x0000_t75" style="width:428.33pt;height:222.90pt;mso-wrap-distance-left:0.00pt;mso-wrap-distance-top:0.00pt;mso-wrap-distance-right:0.00pt;mso-wrap-distance-bottom:0.00pt;z-index:1;" stroked="false">
+                    <v:shape id="_x0000_i8" o:spid="_x0000_s8" type="#_x0000_t75" style="width:428.33pt;height:222.90pt;mso-wrap-distance-left:0.00pt;mso-wrap-distance-top:0.00pt;mso-wrap-distance-right:0.00pt;mso-wrap-distance-bottom:0.00pt;z-index:1;" stroked="false">
                       <v:imagedata r:id="rId19" o:title=""/>
                       <o:lock v:ext="edit" rotation="t"/>
                     </v:shape>
@@ -1881,7 +2612,7 @@
                     <wp:inline xmlns:wp="http://schemas.openxmlformats.org/drawingml/2006/wordprocessingDrawing" distT="0" distB="0" distL="0" distR="0">
                       <wp:extent cx="5592150" cy="2558332"/>
                       <wp:effectExtent l="0" t="0" r="0" b="0"/>
-                      <wp:docPr id="9" name=""/>
+                      <wp:docPr id="10" name=""/>
                       <wp:cNvGraphicFramePr>
                         <a:graphicFrameLocks xmlns:a="http://schemas.openxmlformats.org/drawingml/2006/main" noChangeAspect="1"/>
                       </wp:cNvGraphicFramePr>
@@ -1935,7 +2666,7 @@
                       <v:path o:extrusionok="f" gradientshapeok="t" o:connecttype="rect"/>
                       <o:lock v:ext="edit" aspectratio="t"/>
                     </v:shapetype>
-                    <v:shape id="_x0000_i8" o:spid="_x0000_s8" type="#_x0000_t75" style="width:440.33pt;height:201.44pt;mso-wrap-distance-left:0.00pt;mso-wrap-distance-top:0.00pt;mso-wrap-distance-right:0.00pt;mso-wrap-distance-bottom:0.00pt;z-index:1;" stroked="false">
+                    <v:shape id="_x0000_i9" o:spid="_x0000_s9" type="#_x0000_t75" style="width:440.33pt;height:201.44pt;mso-wrap-distance-left:0.00pt;mso-wrap-distance-top:0.00pt;mso-wrap-distance-right:0.00pt;mso-wrap-distance-bottom:0.00pt;z-index:1;" stroked="false">
                       <v:imagedata r:id="rId20" o:title=""/>
                       <o:lock v:ext="edit" rotation="t"/>
                     </v:shape>
@@ -2101,7 +2832,7 @@
                     <wp:inline xmlns:wp="http://schemas.openxmlformats.org/drawingml/2006/wordprocessingDrawing" distT="0" distB="0" distL="0" distR="0">
                       <wp:extent cx="5538300" cy="2779108"/>
                       <wp:effectExtent l="0" t="0" r="0" b="0"/>
-                      <wp:docPr id="10" name=""/>
+                      <wp:docPr id="11" name=""/>
                       <wp:cNvGraphicFramePr>
                         <a:graphicFrameLocks xmlns:a="http://schemas.openxmlformats.org/drawingml/2006/main" noChangeAspect="1"/>
                       </wp:cNvGraphicFramePr>
@@ -2155,7 +2886,7 @@
                       <v:path o:extrusionok="f" gradientshapeok="t" o:connecttype="rect"/>
                       <o:lock v:ext="edit" aspectratio="t"/>
                     </v:shapetype>
-                    <v:shape id="_x0000_i9" o:spid="_x0000_s9" type="#_x0000_t75" style="width:436.09pt;height:218.83pt;mso-wrap-distance-left:0.00pt;mso-wrap-distance-top:0.00pt;mso-wrap-distance-right:0.00pt;mso-wrap-distance-bottom:0.00pt;z-index:1;" stroked="false">
+                    <v:shape id="_x0000_i10" o:spid="_x0000_s10" type="#_x0000_t75" style="width:436.09pt;height:218.83pt;mso-wrap-distance-left:0.00pt;mso-wrap-distance-top:0.00pt;mso-wrap-distance-right:0.00pt;mso-wrap-distance-bottom:0.00pt;z-index:1;" stroked="false">
                       <v:imagedata r:id="rId21" o:title=""/>
                       <o:lock v:ext="edit" rotation="t"/>
                     </v:shape>
@@ -2236,7 +2967,14 @@
               <w:pBdr/>
               <w:spacing w:after="80"/>
               <w:ind/>
-              <w:rPr/>
+              <w:rPr>
+                <w:b/>
+                <w:bCs/>
+                <w:color w:val="1e3a8a"/>
+                <w:sz w:val="22"/>
+                <w:szCs w:val="22"/>
+                <w:lang w:val="en"/>
+              </w:rPr>
             </w:pPr>
             <w:r>
               <w:rPr>
@@ -2245,34 +2983,22 @@
                 <w:sz w:val="22"/>
               </w:rPr>
               <w:t xml:space="preserve">📸 PROOF-08: Functional Item Submission &amp; Print Flyer View</w:t>
-              <w:br/>
             </w:r>
             <w:r>
               <w:rPr>
-                <w:color w:val="1e293b"/>
-                <w:sz w:val="18"/>
+                <w:b/>
+                <w:color w:val="1e3a8a"/>
+                <w:sz w:val="22"/>
+                <w:lang w:val="en"/>
               </w:rPr>
-              <w:t xml:space="preserve">• AWS Service / Scope: Application Featur</w:t>
-            </w:r>
-            <w:r>
-              <w:rPr>
-                <w:color w:val="1e293b"/>
-                <w:sz w:val="18"/>
-              </w:rPr>
-              <w:t xml:space="preserve">es</w:t>
-              <w:br/>
-              <w:t xml:space="preserve">• Required Evidence: Browser view of a posted lost item detail page and the one-click printable notice flyer with tear-off contact strips.</w:t>
-              <w:br/>
-              <w:t xml:space="preserve">• Verification Action: Navigate to `/items/&lt;id&gt;/print/` in browser &gt; Capture the formatted notice flyer preview.</w:t>
-              <w:br/>
-              <w:br/>
+              <w:t xml:space="preserve">.</w:t>
             </w:r>
             <w:r/>
           </w:p>
           <w:p>
             <w:pPr>
               <w:pBdr/>
-              <w:spacing w:after="240" w:before="160"/>
+              <w:spacing w:after="80"/>
               <w:ind/>
               <w:jc w:val="center"/>
               <w:rPr/>
@@ -2280,11 +3006,88 @@
             <w:r>
               <w:rPr>
                 <w:b/>
-                <w:color w:val="64748b"/>
-                <w:sz w:val="20"/>
+                <w:color w:val="1e3a8a"/>
+                <w:sz w:val="22"/>
+                <w:lang w:val="en"/>
               </w:rPr>
-              <w:t xml:space="preserve">[ 🖼️ PASTE VALIDATION SCREENSHOT HERE — SIZED TO FIT WIDTH ]</w:t>
             </w:r>
+            <w:r>
+              <mc:AlternateContent>
+                <mc:Choice Requires="wpg">
+                  <w:drawing>
+                    <wp:inline xmlns:wp="http://schemas.openxmlformats.org/drawingml/2006/wordprocessingDrawing" distT="0" distB="0" distL="0" distR="0">
+                      <wp:extent cx="5592150" cy="2892489"/>
+                      <wp:effectExtent l="0" t="0" r="0" b="0"/>
+                      <wp:docPr id="12" name=""/>
+                      <wp:cNvGraphicFramePr>
+                        <a:graphicFrameLocks xmlns:a="http://schemas.openxmlformats.org/drawingml/2006/main" noChangeAspect="1"/>
+                      </wp:cNvGraphicFramePr>
+                      <a:graphic xmlns:a="http://schemas.openxmlformats.org/drawingml/2006/main">
+                        <a:graphicData uri="http://schemas.openxmlformats.org/drawingml/2006/picture">
+                          <pic:pic xmlns:pic="http://schemas.openxmlformats.org/drawingml/2006/picture">
+                            <pic:nvPicPr>
+                              <pic:cNvPr id="2020566262" name=""/>
+                              <pic:cNvPicPr>
+                                <a:picLocks noChangeAspect="1"/>
+                              </pic:cNvPicPr>
+                              <pic:nvPr/>
+                            </pic:nvPicPr>
+                            <pic:blipFill rotWithShape="1">
+                              <a:blip r:embed="rId22"/>
+                              <a:stretch/>
+                            </pic:blipFill>
+                            <pic:spPr bwMode="auto">
+                              <a:xfrm flipH="0" flipV="0">
+                                <a:off x="0" y="0"/>
+                                <a:ext cx="5592150" cy="2892489"/>
+                              </a:xfrm>
+                              <a:prstGeom prst="rect">
+                                <a:avLst/>
+                              </a:prstGeom>
+                            </pic:spPr>
+                          </pic:pic>
+                        </a:graphicData>
+                      </a:graphic>
+                    </wp:inline>
+                  </w:drawing>
+                </mc:Choice>
+                <mc:Fallback>
+                  <w:pict>
+                    <v:shapetype id="_x0000_t75" coordsize="21600,21600" o:spt="75" o:preferrelative="t" path="m@4@5l@4@11@9@11@9@5xe" filled="f" stroked="f">
+                      <v:stroke joinstyle="miter"/>
+                      <v:formulas>
+                        <v:f eqn="if lineDrawn pixelLineWidth 0"/>
+                        <v:f eqn="sum @0 1 0"/>
+                        <v:f eqn="sum 0 0 @1"/>
+                        <v:f eqn="prod @2 1 2"/>
+                        <v:f eqn="prod @3 21600 pixelWidth"/>
+                        <v:f eqn="prod @3 21600 pixelHeight"/>
+                        <v:f eqn="sum @0 0 1"/>
+                        <v:f eqn="prod @6 1 2"/>
+                        <v:f eqn="prod @7 21600 pixelWidth"/>
+                        <v:f eqn="sum @8 21600 0"/>
+                        <v:f eqn="prod @7 21600 pixelHeight"/>
+                        <v:f eqn="sum @10 21600 0"/>
+                      </v:formulas>
+                      <v:path o:extrusionok="f" gradientshapeok="t" o:connecttype="rect"/>
+                      <o:lock v:ext="edit" aspectratio="t"/>
+                    </v:shapetype>
+                    <v:shape id="_x0000_i11" o:spid="_x0000_s11" type="#_x0000_t75" style="width:440.33pt;height:227.76pt;mso-wrap-distance-left:0.00pt;mso-wrap-distance-top:0.00pt;mso-wrap-distance-right:0.00pt;mso-wrap-distance-bottom:0.00pt;z-index:1;" stroked="false">
+                      <v:imagedata r:id="rId22" o:title=""/>
+                      <o:lock v:ext="edit" rotation="t"/>
+                    </v:shape>
+                  </w:pict>
+                </mc:Fallback>
+              </mc:AlternateContent>
+            </w:r>
+            <w:r>
+              <w:rPr>
+                <w:color w:val="1e293b"/>
+                <w:sz w:val="18"/>
+              </w:rPr>
+              <w:br/>
+            </w:r>
+            <w:r/>
             <w:r/>
           </w:p>
         </w:tc>
@@ -2335,7 +3138,12 @@
               <w:pBdr/>
               <w:spacing w:after="80"/>
               <w:ind/>
-              <w:rPr/>
+              <w:rPr>
+                <w:color w:val="1e293b"/>
+                <w:sz w:val="18"/>
+                <w:szCs w:val="18"/>
+                <w:highlight w:val="none"/>
+              </w:rPr>
             </w:pPr>
             <w:r>
               <w:rPr>
@@ -2359,14 +3167,155 @@
                 <w:sz w:val="18"/>
               </w:rPr>
               <w:t xml:space="preserve">ce / Django</w:t>
-              <w:br/>
-              <w:t xml:space="preserve">• Required Evidence: Terminal output executing `./venv/bin/python manage.py test` displaying all 15 tests passing with `OK` status.</w:t>
-              <w:br/>
-              <w:t xml:space="preserve">• Verification Action: Run `python manage.py test` in terminal &gt; Capture complete terminal output and summary.</w:t>
-              <w:br/>
-              <w:br/>
             </w:r>
-            <w:r/>
+            <w:r>
+              <w:rPr>
+                <w:color w:val="1e293b"/>
+                <w:sz w:val="18"/>
+                <w:szCs w:val="18"/>
+                <w:highlight w:val="none"/>
+              </w:rPr>
+            </w:r>
+          </w:p>
+          <w:p>
+            <w:pPr>
+              <w:pBdr/>
+              <w:spacing w:after="80"/>
+              <w:ind/>
+              <w:rPr>
+                <w:color w:val="1e293b"/>
+                <w:sz w:val="18"/>
+                <w:szCs w:val="18"/>
+                <w:highlight w:val="none"/>
+              </w:rPr>
+            </w:pPr>
+            <w:r>
+              <w:rPr>
+                <w:color w:val="1e293b"/>
+                <w:sz w:val="18"/>
+                <w:highlight w:val="none"/>
+              </w:rPr>
+            </w:r>
+            <w:r>
+              <w:rPr>
+                <w:color w:val="1e293b"/>
+                <w:sz w:val="18"/>
+                <w:highlight w:val="none"/>
+              </w:rPr>
+            </w:r>
+            <w:r>
+              <w:rPr>
+                <w:color w:val="1e293b"/>
+                <w:sz w:val="18"/>
+                <w:highlight w:val="none"/>
+              </w:rPr>
+            </w:r>
+          </w:p>
+          <w:p>
+            <w:pPr>
+              <w:pBdr/>
+              <w:spacing w:after="80"/>
+              <w:ind/>
+              <w:jc w:val="center"/>
+              <w:rPr/>
+            </w:pPr>
+            <w:r>
+              <w:rPr>
+                <w:color w:val="1e293b"/>
+                <w:sz w:val="18"/>
+                <w:highlight w:val="none"/>
+              </w:rPr>
+            </w:r>
+            <w:r>
+              <mc:AlternateContent>
+                <mc:Choice Requires="wpg">
+                  <w:drawing>
+                    <wp:inline xmlns:wp="http://schemas.openxmlformats.org/drawingml/2006/wordprocessingDrawing" distT="0" distB="0" distL="0" distR="0">
+                      <wp:extent cx="4873500" cy="3021706"/>
+                      <wp:effectExtent l="0" t="0" r="0" b="0"/>
+                      <wp:docPr id="13" name=""/>
+                      <wp:cNvGraphicFramePr>
+                        <a:graphicFrameLocks xmlns:a="http://schemas.openxmlformats.org/drawingml/2006/main" noChangeAspect="1"/>
+                      </wp:cNvGraphicFramePr>
+                      <a:graphic xmlns:a="http://schemas.openxmlformats.org/drawingml/2006/main">
+                        <a:graphicData uri="http://schemas.openxmlformats.org/drawingml/2006/picture">
+                          <pic:pic xmlns:pic="http://schemas.openxmlformats.org/drawingml/2006/picture">
+                            <pic:nvPicPr>
+                              <pic:cNvPr id="230475849" name=""/>
+                              <pic:cNvPicPr>
+                                <a:picLocks noChangeAspect="1"/>
+                              </pic:cNvPicPr>
+                              <pic:nvPr/>
+                            </pic:nvPicPr>
+                            <pic:blipFill rotWithShape="1">
+                              <a:blip r:embed="rId23"/>
+                              <a:stretch/>
+                            </pic:blipFill>
+                            <pic:spPr bwMode="auto">
+                              <a:xfrm flipH="0" flipV="0">
+                                <a:off x="0" y="0"/>
+                                <a:ext cx="4873500" cy="3021706"/>
+                              </a:xfrm>
+                              <a:prstGeom prst="rect">
+                                <a:avLst/>
+                              </a:prstGeom>
+                            </pic:spPr>
+                          </pic:pic>
+                        </a:graphicData>
+                      </a:graphic>
+                    </wp:inline>
+                  </w:drawing>
+                </mc:Choice>
+                <mc:Fallback>
+                  <w:pict>
+                    <v:shapetype id="_x0000_t75" coordsize="21600,21600" o:spt="75" o:preferrelative="t" path="m@4@5l@4@11@9@11@9@5xe" filled="f" stroked="f">
+                      <v:stroke joinstyle="miter"/>
+                      <v:formulas>
+                        <v:f eqn="if lineDrawn pixelLineWidth 0"/>
+                        <v:f eqn="sum @0 1 0"/>
+                        <v:f eqn="sum 0 0 @1"/>
+                        <v:f eqn="prod @2 1 2"/>
+                        <v:f eqn="prod @3 21600 pixelWidth"/>
+                        <v:f eqn="prod @3 21600 pixelHeight"/>
+                        <v:f eqn="sum @0 0 1"/>
+                        <v:f eqn="prod @6 1 2"/>
+                        <v:f eqn="prod @7 21600 pixelWidth"/>
+                        <v:f eqn="sum @8 21600 0"/>
+                        <v:f eqn="prod @7 21600 pixelHeight"/>
+                        <v:f eqn="sum @10 21600 0"/>
+                      </v:formulas>
+                      <v:path o:extrusionok="f" gradientshapeok="t" o:connecttype="rect"/>
+                      <o:lock v:ext="edit" aspectratio="t"/>
+                    </v:shapetype>
+                    <v:shape id="_x0000_i12" o:spid="_x0000_s12" type="#_x0000_t75" style="width:383.74pt;height:237.93pt;mso-wrap-distance-left:0.00pt;mso-wrap-distance-top:0.00pt;mso-wrap-distance-right:0.00pt;mso-wrap-distance-bottom:0.00pt;z-index:1;" stroked="false">
+                      <v:imagedata r:id="rId23" o:title=""/>
+                      <o:lock v:ext="edit" rotation="t"/>
+                    </v:shape>
+                  </w:pict>
+                </mc:Fallback>
+              </mc:AlternateContent>
+            </w:r>
+            <w:r>
+              <w:rPr>
+                <w:color w:val="1e293b"/>
+                <w:sz w:val="18"/>
+                <w:highlight w:val="none"/>
+              </w:rPr>
+            </w:r>
+            <w:r>
+              <w:rPr>
+                <w:color w:val="1e293b"/>
+                <w:sz w:val="18"/>
+                <w:highlight w:val="none"/>
+              </w:rPr>
+            </w:r>
+            <w:r>
+              <w:rPr>
+                <w:color w:val="1e293b"/>
+                <w:sz w:val="18"/>
+                <w:highlight w:val="none"/>
+              </w:rPr>
+            </w:r>
           </w:p>
           <w:p>
             <w:pPr>
@@ -2382,7 +3331,6 @@
                 <w:color w:val="64748b"/>
                 <w:sz w:val="20"/>
               </w:rPr>
-              <w:t xml:space="preserve">[ 🖼️ PASTE VALIDATION SCREENSHOT HERE — SIZED TO FIT WIDTH ]</w:t>
             </w:r>
             <w:r/>
           </w:p>
@@ -2434,7 +3382,13 @@
               <w:pBdr/>
               <w:spacing w:after="80"/>
               <w:ind/>
-              <w:rPr/>
+              <w:rPr>
+                <w:b/>
+                <w:bCs/>
+                <w:color w:val="1e3a8a"/>
+                <w:sz w:val="22"/>
+                <w:szCs w:val="22"/>
+              </w:rPr>
             </w:pPr>
             <w:r>
               <w:rPr>
@@ -2443,46 +3397,103 @@
                 <w:sz w:val="22"/>
               </w:rPr>
               <w:t xml:space="preserve">📸 PROOF-10: GitHub Repository &amp; Version Control Proof</w:t>
-              <w:br/>
-            </w:r>
-            <w:r>
-              <w:rPr>
-                <w:color w:val="1e293b"/>
-                <w:sz w:val="18"/>
-              </w:rPr>
-              <w:t xml:space="preserve">• AWS Service / Scope: Source Control / GitHub</w:t>
-              <w:br/>
-              <w:t xml:space="preserve">• Required Evidenc</w:t>
-            </w:r>
-            <w:r>
-              <w:rPr>
-                <w:color w:val="1e293b"/>
-                <w:sz w:val="18"/>
-              </w:rPr>
-              <w:t xml:space="preserve">e: GitHub repository web page showing commit history, branches, `.gitignore` preventing secret leaks, and `docs/` suite.</w:t>
-              <w:br/>
-              <w:t xml:space="preserve">• Verification Action: Navigate to `https://github.com/cloudcomputinggroup2/campusfind.git` in browser &gt; Capture repository overview.</w:t>
-              <w:br/>
-              <w:br/>
             </w:r>
             <w:r/>
           </w:p>
           <w:p>
             <w:pPr>
               <w:pBdr/>
-              <w:spacing w:after="240" w:before="160"/>
+              <w:spacing w:after="80"/>
               <w:ind/>
-              <w:jc w:val="center"/>
-              <w:rPr/>
+              <w:rPr>
+                <w:highlight w:val="none"/>
+              </w:rPr>
             </w:pPr>
             <w:r>
               <w:rPr>
                 <w:b/>
-                <w:color w:val="64748b"/>
-                <w:sz w:val="20"/>
+                <w:color w:val="1e3a8a"/>
+                <w:sz w:val="22"/>
               </w:rPr>
-              <w:t xml:space="preserve">[ 🖼️ PASTE VALIDATION SCREENSHOT HERE — SIZED TO FIT WIDTH ]</w:t>
             </w:r>
+            <w:r>
+              <w:rPr>
+                <w:color w:val="1e293b"/>
+                <w:sz w:val="18"/>
+                <w:lang w:val="en"/>
+              </w:rPr>
+              <w:t xml:space="preserve"> </w:t>
+            </w:r>
+            <w:r>
+              <mc:AlternateContent>
+                <mc:Choice Requires="wpg">
+                  <w:drawing>
+                    <wp:inline xmlns:wp="http://schemas.openxmlformats.org/drawingml/2006/wordprocessingDrawing" distT="0" distB="0" distL="0" distR="0">
+                      <wp:extent cx="5182575" cy="2274711"/>
+                      <wp:effectExtent l="0" t="0" r="0" b="0"/>
+                      <wp:docPr id="14" name=""/>
+                      <wp:cNvGraphicFramePr>
+                        <a:graphicFrameLocks xmlns:a="http://schemas.openxmlformats.org/drawingml/2006/main" noChangeAspect="1"/>
+                      </wp:cNvGraphicFramePr>
+                      <a:graphic xmlns:a="http://schemas.openxmlformats.org/drawingml/2006/main">
+                        <a:graphicData uri="http://schemas.openxmlformats.org/drawingml/2006/picture">
+                          <pic:pic xmlns:pic="http://schemas.openxmlformats.org/drawingml/2006/picture">
+                            <pic:nvPicPr>
+                              <pic:cNvPr id="1964840708" name=""/>
+                              <pic:cNvPicPr>
+                                <a:picLocks noChangeAspect="1"/>
+                              </pic:cNvPicPr>
+                              <pic:nvPr/>
+                            </pic:nvPicPr>
+                            <pic:blipFill rotWithShape="1">
+                              <a:blip r:embed="rId24"/>
+                              <a:stretch/>
+                            </pic:blipFill>
+                            <pic:spPr bwMode="auto">
+                              <a:xfrm flipH="0" flipV="0">
+                                <a:off x="0" y="0"/>
+                                <a:ext cx="5182574" cy="2274710"/>
+                              </a:xfrm>
+                              <a:prstGeom prst="rect">
+                                <a:avLst/>
+                              </a:prstGeom>
+                            </pic:spPr>
+                          </pic:pic>
+                        </a:graphicData>
+                      </a:graphic>
+                    </wp:inline>
+                  </w:drawing>
+                </mc:Choice>
+                <mc:Fallback>
+                  <w:pict>
+                    <v:shapetype id="_x0000_t75" coordsize="21600,21600" o:spt="75" o:preferrelative="t" path="m@4@5l@4@11@9@11@9@5xe" filled="f" stroked="f">
+                      <v:stroke joinstyle="miter"/>
+                      <v:formulas>
+                        <v:f eqn="if lineDrawn pixelLineWidth 0"/>
+                        <v:f eqn="sum @0 1 0"/>
+                        <v:f eqn="sum 0 0 @1"/>
+                        <v:f eqn="prod @2 1 2"/>
+                        <v:f eqn="prod @3 21600 pixelWidth"/>
+                        <v:f eqn="prod @3 21600 pixelHeight"/>
+                        <v:f eqn="sum @0 0 1"/>
+                        <v:f eqn="prod @6 1 2"/>
+                        <v:f eqn="prod @7 21600 pixelWidth"/>
+                        <v:f eqn="sum @8 21600 0"/>
+                        <v:f eqn="prod @7 21600 pixelHeight"/>
+                        <v:f eqn="sum @10 21600 0"/>
+                      </v:formulas>
+                      <v:path o:extrusionok="f" gradientshapeok="t" o:connecttype="rect"/>
+                      <o:lock v:ext="edit" aspectratio="t"/>
+                    </v:shapetype>
+                    <v:shape id="_x0000_i13" o:spid="_x0000_s13" type="#_x0000_t75" style="width:408.08pt;height:179.11pt;mso-wrap-distance-left:0.00pt;mso-wrap-distance-top:0.00pt;mso-wrap-distance-right:0.00pt;mso-wrap-distance-bottom:0.00pt;z-index:1;" stroked="false">
+                      <v:imagedata r:id="rId24" o:title=""/>
+                      <o:lock v:ext="edit" rotation="t"/>
+                    </v:shape>
+                  </w:pict>
+                </mc:Fallback>
+              </mc:AlternateContent>
+            </w:r>
+            <w:r/>
             <w:r/>
           </w:p>
         </w:tc>
@@ -3149,10 +4160,136 @@
         <w:rPr/>
       </w:pPr>
       <w:r/>
+      <w:r/>
+      <w:r/>
+    </w:p>
+    <w:p>
+      <w:pPr>
+        <w:pBdr/>
+        <w:spacing/>
+        <w:ind/>
+        <w:rPr/>
+      </w:pPr>
+      <w:r/>
+      <w:r/>
+      <w:r/>
+    </w:p>
+    <w:p>
+      <w:pPr>
+        <w:pBdr/>
+        <w:spacing/>
+        <w:ind/>
+        <w:rPr/>
+      </w:pPr>
+      <w:r/>
+      <w:r/>
+      <w:r/>
+    </w:p>
+    <w:p>
+      <w:pPr>
+        <w:pBdr/>
+        <w:spacing/>
+        <w:ind/>
+        <w:rPr/>
+      </w:pPr>
+      <w:r/>
+      <w:r/>
+      <w:r/>
+    </w:p>
+    <w:p>
+      <w:pPr>
+        <w:pBdr/>
+        <w:spacing/>
+        <w:ind/>
+        <w:rPr/>
+      </w:pPr>
+      <w:r/>
+      <w:r/>
+      <w:r/>
+    </w:p>
+    <w:p>
+      <w:pPr>
+        <w:pBdr/>
+        <w:spacing/>
+        <w:ind/>
+        <w:rPr/>
+      </w:pPr>
+      <w:r/>
+      <w:r/>
+      <w:r/>
+    </w:p>
+    <w:p>
+      <w:pPr>
+        <w:pBdr/>
+        <w:spacing/>
+        <w:ind/>
+        <w:rPr/>
+      </w:pPr>
+      <w:r/>
+      <w:r/>
+      <w:r/>
+    </w:p>
+    <w:p>
+      <w:pPr>
+        <w:pStyle w:val="713"/>
+        <w:keepNext w:val="true"/>
+        <w:pBdr/>
+        <w:spacing w:after="80" w:before="280"/>
+        <w:ind/>
+        <w:rPr/>
+      </w:pPr>
+      <w:r>
+        <w:rPr>
+          <w:b/>
+          <w:color w:val="1e3a8a"/>
+          <w:sz w:val="32"/>
+          <w:lang w:val="en"/>
+        </w:rPr>
+        <w:t xml:space="preserve">4.</w:t>
+      </w:r>
+      <w:r>
+        <w:rPr>
+          <w:b/>
+          <w:color w:val="1e3a8a"/>
+          <w:sz w:val="32"/>
+        </w:rPr>
+        <w:t xml:space="preserve"> </w:t>
+      </w:r>
+      <w:r>
+        <w:rPr>
+          <w:b/>
+          <w:color w:val="1e3a8a"/>
+          <w:sz w:val="32"/>
+          <w:lang w:val="en"/>
+        </w:rPr>
+        <w:t xml:space="preserve">Group Members</w:t>
+      </w:r>
+      <w:r/>
+      <w:r/>
+    </w:p>
+    <w:p>
+      <w:pPr>
+        <w:pBdr/>
+        <w:spacing/>
+        <w:ind/>
+        <w:rPr/>
+      </w:pPr>
+      <w:r/>
+      <w:r/>
+      <w:r/>
+    </w:p>
+    <w:p>
+      <w:pPr>
+        <w:pBdr/>
+        <w:spacing/>
+        <w:ind/>
+        <w:rPr/>
+      </w:pPr>
+      <w:r/>
+      <w:r/>
     </w:p>
     <w:sectPr>
-      <w:headerReference w:type="default" r:id="rId9"/>
-      <w:footerReference w:type="default" r:id="rId10"/>
+      <w:footerReference w:type="default" r:id="rId9"/>
       <w:footnotePr/>
       <w:endnotePr/>
       <w:type w:val="nextPage"/>
@@ -3255,29 +4392,6 @@
     </w:p>
   </w:footnote>
 </w:footnotes>
-</file>
-
-<file path=word/header1.xml><?xml version="1.0" encoding="utf-8"?>
-<w:hdr xmlns:wpc="http://schemas.microsoft.com/office/word/2010/wordprocessingCanvas" xmlns:mc="http://schemas.openxmlformats.org/markup-compatibility/2006" xmlns:o="urn:schemas-microsoft-com:office:office" xmlns:r="http://schemas.openxmlformats.org/officeDocument/2006/relationships" xmlns:m="http://schemas.openxmlformats.org/officeDocument/2006/math" xmlns:v="urn:schemas-microsoft-com:vml" xmlns:wp14="http://schemas.microsoft.com/office/word/2010/wordprocessingDrawing" xmlns:wp="http://schemas.openxmlformats.org/drawingml/2006/wordprocessingDrawing" xmlns:w10="urn:schemas-microsoft-com:office:word" xmlns:w="http://schemas.openxmlformats.org/wordprocessingml/2006/main" xmlns:w14="http://schemas.microsoft.com/office/word/2010/wordml" xmlns:w15="http://schemas.microsoft.com/office/word/2012/wordml" xmlns:wpg="http://schemas.microsoft.com/office/word/2010/wordprocessingGroup" xmlns:wpi="http://schemas.microsoft.com/office/word/2010/wordprocessingInk" xmlns:wne="http://schemas.microsoft.com/office/word/2006/wordml" xmlns:a="http://schemas.openxmlformats.org/drawingml/2006/main" xmlns:wps="http://schemas.microsoft.com/office/word/2010/wordprocessingShape" mc:Ignorable="w14 w15 wp14">
-  <w:p>
-    <w:pPr>
-      <w:pStyle w:val="709"/>
-      <w:pBdr/>
-      <w:spacing/>
-      <w:ind/>
-      <w:jc w:val="right"/>
-      <w:rPr/>
-    </w:pPr>
-    <w:r>
-      <w:rPr>
-        <w:color w:val="64748b"/>
-        <w:sz w:val="17"/>
-      </w:rPr>
-      <w:t xml:space="preserve">CampusFind Capstone | Deployment Proof Portfolio</w:t>
-    </w:r>
-    <w:r/>
-  </w:p>
-</w:hdr>
 </file>
 
 <file path=word/numbering.xml><?xml version="1.0" encoding="utf-8"?>

</xml_diff>